<commit_message>
docs(tracking): make the task-log labels consistently bold
The three tasks I appended for 19/08 had plain "What I did:" labels while
the surrounding entries bold theirs, so the document read as two
different styles.

Fixing that also corrected 35 pre-existing entries with the same
inconsistency — more than my own additions. That is a deliberate tidy of
a document that goes to a reader, not an accident, but worth stating: the
edit touched paragraphs beyond the ones added today. No wording was
changed anywhere; only the label run is now bold.

Co-Authored-By: Claude Opus 5 (1M context) <noreply@anthropic.com>
</commit_message>
<xml_diff>
--- a/internship-tracking/task_wise_daily_summary.docx
+++ b/internship-tracking/task_wise_daily_summary.docx
@@ -2738,6 +2738,9 @@
         </w:rPr>
       </w:pPr>
       <w:r>
+        <w:rPr>
+          <w:b/>
+        </w:rPr>
         <w:t>Challenges faced:</w:t>
       </w:r>
     </w:p>
@@ -2878,6 +2881,9 @@
         </w:rPr>
       </w:pPr>
       <w:r>
+        <w:rPr>
+          <w:b/>
+        </w:rPr>
         <w:t>Challenges faced:</w:t>
       </w:r>
     </w:p>
@@ -2998,6 +3004,9 @@
         </w:rPr>
       </w:pPr>
       <w:r>
+        <w:rPr>
+          <w:b/>
+        </w:rPr>
         <w:t>Challenges faced:</w:t>
       </w:r>
     </w:p>
@@ -3138,6 +3147,9 @@
         </w:rPr>
       </w:pPr>
       <w:r>
+        <w:rPr>
+          <w:b/>
+        </w:rPr>
         <w:t>Challenges faced:</w:t>
       </w:r>
     </w:p>
@@ -3298,7 +3310,14 @@
         </w:rPr>
       </w:pPr>
       <w:r>
-        <w:t>Challenges faced: Nothing significant.</w:t>
+        <w:rPr>
+          <w:b/>
+        </w:rPr>
+        <w:t>Challenges faced:</w:t>
+      </w:r>
+      <w:r>
+        <w:rPr/>
+        <w:t xml:space="preserve"> Nothing significant.</w:t>
       </w:r>
     </w:p>
     <w:p>
@@ -3918,24 +3937,48 @@
     <w:p>
       <w:pPr/>
       <w:r>
-        <w:t>What I did: Made the assistant understand misspelled questions. Measured first: three of four misspelled questions about documents we hold were scoring below the routing floor and being answered from general knowledge instead — which reads to a user as the assistant not knowing its own documents, the exact failure the routing work had just fixed.</w:t>
+        <w:rPr>
+          <w:b/>
+        </w:rPr>
+        <w:t xml:space="preserve">What I did: </w:t>
+      </w:r>
+      <w:r>
+        <w:rPr/>
+        <w:t>Made the assistant understand misspelled questions. Measured first: three of four misspelled questions about documents we hold were scoring below the routing floor and being answered from general knowledge instead — which reads to a user as the assistant not knowing its own documents, the exact failure the routing work had just fixed.</w:t>
       </w:r>
     </w:p>
     <w:p>
       <w:pPr/>
       <w:r>
-        <w:t>Decision made: Corrections may only be drawn from the vocabulary of whatever documents are currently ingested, rebuilt automatically on every upload. No hand-written dictionary anywhere in the feature — that is precisely what would have broken the moment real stakeholder documents arrived. A correction can therefore only ever move a query toward text the index actually contains, and a typo in a word no document uses stays uncorrected, which is correct because such a question was never going to be answered from the documents anyway.</w:t>
+        <w:rPr>
+          <w:b/>
+        </w:rPr>
+        <w:t xml:space="preserve">Decision made: </w:t>
+      </w:r>
+      <w:r>
+        <w:rPr/>
+        <w:t>Corrections may only be drawn from the vocabulary of whatever documents are currently ingested, rebuilt automatically on every upload. No hand-written dictionary anywhere in the feature — that is precisely what would have broken the moment real stakeholder documents arrived. A correction can therefore only ever move a query toward text the index actually contains, and a typo in a word no document uses stays uncorrected, which is correct because such a question was never going to be answered from the documents anyway.</w:t>
       </w:r>
     </w:p>
     <w:p>
       <w:pPr/>
       <w:r>
-        <w:t>How I implemented it: Layers, cheapest first. Ordinary typos are matched by edit distance, with transposition counted as a single edit since it is the most common real slip. Misspellings too far off for that are matched on consonant skeleton, which ignores vowels and so recovers “diprisiation” as “depreciation”. Both run in memory in well under a millisecond with no model call and no GPU. Correction is applied to the search query, and — after a defect described below — to the question the model is asked as well. Proved the feature generalises by ingesting a document never used in development and confirming typos in its vocabulary were corrected with no code change, then removing it again.</w:t>
+        <w:rPr>
+          <w:b/>
+        </w:rPr>
+        <w:t xml:space="preserve">How I implemented it: </w:t>
+      </w:r>
+      <w:r>
+        <w:rPr/>
+        <w:t>Layers, cheapest first. Ordinary typos are matched by edit distance, with transposition counted as a single edit since it is the most common real slip. Misspellings too far off for that are matched on consonant skeleton, which ignores vowels and so recovers “diprisiation” as “depreciation”. Both run in memory in well under a millisecond with no model call and no GPU. Correction is applied to the search query, and — after a defect described below — to the question the model is asked as well. Proved the feature generalises by ingesting a document never used in development and confirming typos in its vocabulary were corrected with no code change, then removing it again.</w:t>
       </w:r>
     </w:p>
     <w:p>
       <w:pPr/>
       <w:r>
+        <w:rPr>
+          <w:b/>
+        </w:rPr>
         <w:t>Challenges faced:</w:t>
       </w:r>
     </w:p>
@@ -3966,24 +4009,48 @@
     <w:p>
       <w:pPr/>
       <w:r>
-        <w:t>What I did: Created working accounts for the six colleagues beginning testing, and removed the shared password the chat integration had been using.</w:t>
+        <w:rPr>
+          <w:b/>
+        </w:rPr>
+        <w:t xml:space="preserve">What I did: </w:t>
+      </w:r>
+      <w:r>
+        <w:rPr/>
+        <w:t>Created working accounts for the six colleagues beginning testing, and removed the shared password the chat integration had been using.</w:t>
       </w:r>
     </w:p>
     <w:p>
       <w:pPr/>
       <w:r>
-        <w:t>Decision made: Stop the chat integration impersonating users with a password. It had been logging in as each user with a single password written into the source code, which meant “users can change their own password” and “the chat works” could not both be true. It now holds one service credential and asks the backend for a session by name, so it never handles user passwords at all. Identity is taken from the email address rather than the display name, because a display name is free text an administrator can edit.</w:t>
+        <w:rPr>
+          <w:b/>
+        </w:rPr>
+        <w:t xml:space="preserve">Decision made: </w:t>
+      </w:r>
+      <w:r>
+        <w:rPr/>
+        <w:t>Stop the chat integration impersonating users with a password. It had been logging in as each user with a single password written into the source code, which meant “users can change their own password” and “the chat works” could not both be true. It now holds one service credential and asks the backend for a session by name, so it never handles user passwords at all. Identity is taken from the email address rather than the display name, because a display name is free text an administrator can edit.</w:t>
       </w:r>
     </w:p>
     <w:p>
       <w:pPr/>
       <w:r>
-        <w:t>How I implemented it: Added a service-token route that issues a session for a named user, compared in constant time and failing closed so an unset secret disables the route rather than accepting an empty one. Added the account operations that had never existed outside a seed script: create a user, change your own password, and an administrator reset — the reset deliberately on its own route, because the general update route logs the fields it changed and a password must never reach the logs. Replaced the one-shot seed script with one that reconciles the roster and can be re-run safely.</w:t>
+        <w:rPr>
+          <w:b/>
+        </w:rPr>
+        <w:t xml:space="preserve">How I implemented it: </w:t>
+      </w:r>
+      <w:r>
+        <w:rPr/>
+        <w:t>Added a service-token route that issues a session for a named user, compared in constant time and failing closed so an unset secret disables the route rather than accepting an empty one. Added the account operations that had never existed outside a seed script: create a user, change your own password, and an administrator reset — the reset deliberately on its own route, because the general update route logs the fields it changed and a password must never reach the logs. Replaced the one-shot seed script with one that reconciles the roster and can be re-run safely.</w:t>
       </w:r>
     </w:p>
     <w:p>
       <w:pPr/>
       <w:r>
+        <w:rPr>
+          <w:b/>
+        </w:rPr>
         <w:t>Challenges faced:</w:t>
       </w:r>
     </w:p>
@@ -4014,24 +4081,48 @@
     <w:p>
       <w:pPr/>
       <w:r>
-        <w:t>What I did: Made the system accept the file formats the testers actually use, and made ingestion fast enough to do in front of them.</w:t>
+        <w:rPr>
+          <w:b/>
+        </w:rPr>
+        <w:t xml:space="preserve">What I did: </w:t>
+      </w:r>
+      <w:r>
+        <w:rPr/>
+        <w:t>Made the system accept the file formats the testers actually use, and made ingestion fast enough to do in front of them.</w:t>
       </w:r>
     </w:p>
     <w:p>
       <w:pPr/>
       <w:r>
-        <w:t>Decision made: Audit what the system genuinely accepted rather than what it claimed to, and dispatch on each file’s own binary signature rather than its extension, since files are routinely misnamed. Cost turned out to be driven by the number of text sections a file produces rather than its size, so the ceiling is placed on sections and spread proportionally across a workbook’s sheets — truncating by taking the first N sections would have made the last dozen sheets of a twenty-sheet workbook silently unsearchable.</w:t>
+        <w:rPr>
+          <w:b/>
+        </w:rPr>
+        <w:t xml:space="preserve">Decision made: </w:t>
+      </w:r>
+      <w:r>
+        <w:rPr/>
+        <w:t>Audit what the system genuinely accepted rather than what it claimed to, and dispatch on each file’s own binary signature rather than its extension, since files are routinely misnamed. Cost turned out to be driven by the number of text sections a file produces rather than its size, so the ceiling is placed on sections and spread proportionally across a workbook’s sheets — truncating by taking the first N sections would have made the last dozen sheets of a twenty-sheet workbook silently unsearchable.</w:t>
       </w:r>
     </w:p>
     <w:p>
       <w:pPr/>
       <w:r>
-        <w:t>How I implemented it: Macro-enabled Excel was not an accepted format at all, and both pre-2007 formats were listed as supported while failing on every real file, because the libraries behind them read only the modern formats. Added readers for the older binary Word and Excel formats, plus plain text, Markdown and CSV with the delimiter detected rather than assumed. Then traced the hour-long ingestion of a five-megabyte workbook to the embedding model running on the processor: the container already shipped the correct GPU build, it had simply never been granted access to the card. Two configuration lines brought the same file down to 58 seconds while indexing twice as much of it.</w:t>
+        <w:rPr>
+          <w:b/>
+        </w:rPr>
+        <w:t xml:space="preserve">How I implemented it: </w:t>
+      </w:r>
+      <w:r>
+        <w:rPr/>
+        <w:t>Macro-enabled Excel was not an accepted format at all, and both pre-2007 formats were listed as supported while failing on every real file, because the libraries behind them read only the modern formats. Added readers for the older binary Word and Excel formats, plus plain text, Markdown and CSV with the delimiter detected rather than assumed. Then traced the hour-long ingestion of a five-megabyte workbook to the embedding model running on the processor: the container already shipped the correct GPU build, it had simply never been granted access to the card. Two configuration lines brought the same file down to 58 seconds while indexing twice as much of it.</w:t>
       </w:r>
     </w:p>
     <w:p>
       <w:pPr/>
       <w:r>
+        <w:rPr>
+          <w:b/>
+        </w:rPr>
         <w:t>Challenges faced:</w:t>
       </w:r>
     </w:p>
@@ -4070,24 +4161,48 @@
     <w:p>
       <w:pPr/>
       <w:r>
-        <w:t>What I did: Resolved the design question Dhruv raised — that much of the ERP content is also described in the documents, so how does the system know which to answer from — and wrote the contract his adapter will be built against.</w:t>
+        <w:rPr>
+          <w:b/>
+        </w:rPr>
+        <w:t xml:space="preserve">What I did: </w:t>
+      </w:r>
+      <w:r>
+        <w:rPr/>
+        <w:t>Resolved the design question Dhruv raised — that much of the ERP content is also described in the documents, so how does the system know which to answer from — and wrote the contract his adapter will be built against.</w:t>
       </w:r>
     </w:p>
     <w:p>
       <w:pPr/>
       <w:r>
-        <w:t>Decision made: The choice cannot be made from what a question is about, because both sources are about the same subjects; that is a property of the data and gets worse as more systems are connected. It can be made from what the question asks for: the documents hold what is written down, the ERP holds what is currently recorded. “What is our invoice approval process” is a document question and “what was invoiced on this document number” is not, though both contain the word invoice. Deliberately built no ERP routing: there is no data yet, and a half-connected integration returning a wrong figure is a worse outcome than the assistant saying the subject is not covered.</w:t>
+        <w:rPr>
+          <w:b/>
+        </w:rPr>
+        <w:t xml:space="preserve">Decision made: </w:t>
+      </w:r>
+      <w:r>
+        <w:rPr/>
+        <w:t>The choice cannot be made from what a question is about, because both sources are about the same subjects; that is a property of the data and gets worse as more systems are connected. It can be made from what the question asks for: the documents hold what is written down, the ERP holds what is currently recorded. “What is our invoice approval process” is a document question and “what was invoiced on this document number” is not, though both contain the word invoice. Deliberately built no ERP routing: there is no data yet, and a half-connected integration returning a wrong figure is a worse outcome than the assistant saying the subject is not covered.</w:t>
       </w:r>
     </w:p>
     <w:p>
       <w:pPr/>
       <w:r>
-        <w:t>How I implemented it: Replaced the adapter interface’s yes/no capability check with a coverage assessment returning a comparable confidence score, since a boolean cannot be weighed against the retrieval score the router already computes. The adapter decides, not the orchestrator, because the orchestrator cannot see inside a system it does not own. Encoded the real document-number formats Dhruv supplied and the thirteen subjects his integration cannot answer, which are refused explicitly rather than falling through to the documents.</w:t>
+        <w:rPr>
+          <w:b/>
+        </w:rPr>
+        <w:t xml:space="preserve">How I implemented it: </w:t>
+      </w:r>
+      <w:r>
+        <w:rPr/>
+        <w:t>Replaced the adapter interface’s yes/no capability check with a coverage assessment returning a comparable confidence score, since a boolean cannot be weighed against the retrieval score the router already computes. The adapter decides, not the orchestrator, because the orchestrator cannot see inside a system it does not own. Encoded the real document-number formats Dhruv supplied and the thirteen subjects his integration cannot answer, which are refused explicitly rather than falling through to the documents.</w:t>
       </w:r>
     </w:p>
     <w:p>
       <w:pPr/>
       <w:r>
+        <w:rPr>
+          <w:b/>
+        </w:rPr>
         <w:t>Challenges faced:</w:t>
       </w:r>
     </w:p>
@@ -4118,24 +4233,48 @@
     <w:p>
       <w:pPr/>
       <w:r>
-        <w:t>What I did: Added the ability to remove a document, gave the administrator account a chat login, wrote the handbooks the testers and I work from, and closed a trap in the chat interface before the pilot began.</w:t>
+        <w:rPr>
+          <w:b/>
+        </w:rPr>
+        <w:t xml:space="preserve">What I did: </w:t>
+      </w:r>
+      <w:r>
+        <w:rPr/>
+        <w:t>Added the ability to remove a document, gave the administrator account a chat login, wrote the handbooks the testers and I work from, and closed a trap in the chat interface before the pilot began.</w:t>
       </w:r>
     </w:p>
     <w:p>
       <w:pPr/>
       <w:r>
-        <w:t>Decision made: Removing a document deletes its vectors before its database rows. The vectors are what retrieval actually reads, so removing them first is what makes the document stop appearing in answers, and a failure part-way through then leaves orphaned database rows — invisible to users — rather than orphaned vectors, which would keep being retrieved with nothing left to identify them by. The uploaded file itself is kept, matching the pipeline's existing guarantee that an upload is never destroyed; what is removed is the assistant's ability to find and quote it.</w:t>
+        <w:rPr>
+          <w:b/>
+        </w:rPr>
+        <w:t xml:space="preserve">Decision made: </w:t>
+      </w:r>
+      <w:r>
+        <w:rPr/>
+        <w:t>Removing a document deletes its vectors before its database rows. The vectors are what retrieval actually reads, so removing them first is what makes the document stop appearing in answers, and a failure part-way through then leaves orphaned database rows — invisible to users — rather than orphaned vectors, which would keep being retrieved with nothing left to identify them by. The uploaded file itself is kept, matching the pipeline's existing guarantee that an upload is never destroyed; what is removed is the assistant's ability to find and quote it.</w:t>
       </w:r>
     </w:p>
     <w:p>
       <w:pPr/>
       <w:r>
-        <w:t>How I implemented it: A delete endpoint restricted to file administrators, batched so a workbook contributing thousands of vectors does not exceed the search engine's request limits, followed by a keyword-index rebuild since that index is held separately in memory. Verified end to end by uploading a document, confirming it was answerable with a citation, deleting it, and confirming the same question then fell through to general knowledge with the corpus back to its exact original size.</w:t>
+        <w:rPr>
+          <w:b/>
+        </w:rPr>
+        <w:t xml:space="preserve">How I implemented it: </w:t>
+      </w:r>
+      <w:r>
+        <w:rPr/>
+        <w:t>A delete endpoint restricted to file administrators, batched so a workbook contributing thousands of vectors does not exceed the search engine's request limits, followed by a keyword-index rebuild since that index is held separately in memory. Verified end to end by uploading a document, confirming it was answerable with a citation, deleting it, and confirming the same question then fell through to general knowledge with the corpus back to its exact original size.</w:t>
       </w:r>
     </w:p>
     <w:p>
       <w:pPr/>
       <w:r>
+        <w:rPr>
+          <w:b/>
+        </w:rPr>
         <w:t>Challenges faced:</w:t>
       </w:r>
     </w:p>
@@ -4274,7 +4413,7 @@
           <w:sz w:val="24"/>
           <w:szCs w:val="24"/>
         </w:rPr>
-        <w:t xml:space="preserve">Challenges faced:</w:t>
+        <w:t>Challenges faced:</w:t>
       </w:r>
     </w:p>
     <w:p>
@@ -4398,7 +4537,7 @@
           <w:sz w:val="24"/>
           <w:szCs w:val="24"/>
         </w:rPr>
-        <w:t xml:space="preserve">Challenges faced:</w:t>
+        <w:t>Challenges faced:</w:t>
       </w:r>
     </w:p>
     <w:p>
@@ -4522,7 +4661,7 @@
           <w:sz w:val="24"/>
           <w:szCs w:val="24"/>
         </w:rPr>
-        <w:t xml:space="preserve">Challenges faced:</w:t>
+        <w:t>Challenges faced:</w:t>
       </w:r>
     </w:p>
     <w:p>
@@ -4551,21 +4690,45 @@
     </w:p>
     <w:p>
       <w:r>
-        <w:t>What I did: Built the ability for a person to attach a file to a conversation and ask questions about it, where that file is readable only inside that conversation and only by the person who attached it. Also built the administrator view of what is being held, the ability to withdraw a single file, and an automatic reclamation process.</w:t>
-      </w:r>
-    </w:p>
-    <w:p>
-      <w:r>
-        <w:t>Decision made: Attached files are kept in a store of their own, separate from the main document set, rather than being tagged inside it. This was the deciding factor: every account on the system currently resolves to unrestricted access, so a filter written slightly wrong would have exposed one person’s file to everyone. With a separate store, exposure is prevented by the structure — the ordinary search does not look there at all. I also decided attachments should not expire, because a file vanishing part-way through a conversation is worse than the storage it occupies.</w:t>
-      </w:r>
-    </w:p>
-    <w:p>
-      <w:r>
-        <w:t>How I implemented it: Reclamation compares the conversations that still exist against the files being held and removes only the difference. Because the failure mode of such a process is deleting everything rather than deleting too little, it refuses to act when the list of conversations cannot be read, when that list comes back empty, or when it would remove an implausibly large share of what is held. It also spares anything uploaded in the last hour, since a file can be attached before the conversation record itself has been saved.</w:t>
-      </w:r>
-    </w:p>
-    <w:p>
-      <w:r>
+        <w:rPr>
+          <w:b/>
+        </w:rPr>
+        <w:t xml:space="preserve">What I did: </w:t>
+      </w:r>
+      <w:r>
+        <w:rPr/>
+        <w:t>Built the ability for a person to attach a file to a conversation and ask questions about it, where that file is readable only inside that conversation and only by the person who attached it. Also built the administrator view of what is being held, the ability to withdraw a single file, and an automatic reclamation process.</w:t>
+      </w:r>
+    </w:p>
+    <w:p>
+      <w:r>
+        <w:rPr>
+          <w:b/>
+        </w:rPr>
+        <w:t xml:space="preserve">Decision made: </w:t>
+      </w:r>
+      <w:r>
+        <w:rPr/>
+        <w:t>Attached files are kept in a store of their own, separate from the main document set, rather than being tagged inside it. This was the deciding factor: every account on the system currently resolves to unrestricted access, so a filter written slightly wrong would have exposed one person’s file to everyone. With a separate store, exposure is prevented by the structure — the ordinary search does not look there at all. I also decided attachments should not expire, because a file vanishing part-way through a conversation is worse than the storage it occupies.</w:t>
+      </w:r>
+    </w:p>
+    <w:p>
+      <w:r>
+        <w:rPr>
+          <w:b/>
+        </w:rPr>
+        <w:t xml:space="preserve">How I implemented it: </w:t>
+      </w:r>
+      <w:r>
+        <w:rPr/>
+        <w:t>Reclamation compares the conversations that still exist against the files being held and removes only the difference. Because the failure mode of such a process is deleting everything rather than deleting too little, it refuses to act when the list of conversations cannot be read, when that list comes back empty, or when it would remove an implausibly large share of what is held. It also spares anything uploaded in the last hour, since a file can be attached before the conversation record itself has been saved.</w:t>
+      </w:r>
+    </w:p>
+    <w:p>
+      <w:r>
+        <w:rPr>
+          <w:b/>
+        </w:rPr>
         <w:t>Challenges faced:</w:t>
       </w:r>
     </w:p>
@@ -4603,21 +4766,45 @@
     </w:p>
     <w:p>
       <w:r>
-        <w:t>What I did: Made generated Word and Excel files actually reach the user. The assistant could already build them correctly, but they were being discarded, so a person was told their export had succeeded and received nothing.</w:t>
-      </w:r>
-    </w:p>
-    <w:p>
-      <w:r>
-        <w:t>Decision made: The project notes recorded this as a fault in how the model requests files. Testing each layer separately showed that was wrong — the model asks correctly and the file generators produce valid documents that open cleanly. Only the delivery step was missing. Correcting the diagnosis first meant the work was a few hours rather than an attempt to replace the model.</w:t>
-      </w:r>
-    </w:p>
-    <w:p>
-      <w:r>
-        <w:t>How I implemented it: Generated files are stored under a path that begins with the owner’s identity, so there is no ownership check that can be forgotten — a different person resolving the same file reference looks somewhere else and finds nothing. The reply carries a link, and that link grants one file to one person rather than access to the account, so a link that is shared or leaked exposes only that single file.</w:t>
-      </w:r>
-    </w:p>
-    <w:p>
-      <w:r>
+        <w:rPr>
+          <w:b/>
+        </w:rPr>
+        <w:t xml:space="preserve">What I did: </w:t>
+      </w:r>
+      <w:r>
+        <w:rPr/>
+        <w:t>Made generated Word and Excel files actually reach the user. The assistant could already build them correctly, but they were being discarded, so a person was told their export had succeeded and received nothing.</w:t>
+      </w:r>
+    </w:p>
+    <w:p>
+      <w:r>
+        <w:rPr>
+          <w:b/>
+        </w:rPr>
+        <w:t xml:space="preserve">Decision made: </w:t>
+      </w:r>
+      <w:r>
+        <w:rPr/>
+        <w:t>The project notes recorded this as a fault in how the model requests files. Testing each layer separately showed that was wrong — the model asks correctly and the file generators produce valid documents that open cleanly. Only the delivery step was missing. Correcting the diagnosis first meant the work was a few hours rather than an attempt to replace the model.</w:t>
+      </w:r>
+    </w:p>
+    <w:p>
+      <w:r>
+        <w:rPr>
+          <w:b/>
+        </w:rPr>
+        <w:t xml:space="preserve">How I implemented it: </w:t>
+      </w:r>
+      <w:r>
+        <w:rPr/>
+        <w:t>Generated files are stored under a path that begins with the owner’s identity, so there is no ownership check that can be forgotten — a different person resolving the same file reference looks somewhere else and finds nothing. The reply carries a link, and that link grants one file to one person rather than access to the account, so a link that is shared or leaked exposes only that single file.</w:t>
+      </w:r>
+    </w:p>
+    <w:p>
+      <w:r>
+        <w:rPr>
+          <w:b/>
+        </w:rPr>
         <w:t>Challenges faced:</w:t>
       </w:r>
     </w:p>
@@ -4647,21 +4834,45 @@
     </w:p>
     <w:p>
       <w:r>
-        <w:t>What I did: Wrote and ran a deliberate attack suite against the live assistant, covering instructions hidden in document contents, instructions in the question itself, attempts to make it recite its own operating instructions, attempts to reach another person’s files through it, misuse of the file-export feature, and invented sources. It found real faults, which I then fixed.</w:t>
-      </w:r>
-    </w:p>
-    <w:p>
-      <w:r>
-        <w:t>Decision made: I made the attack checks mechanical by planting a distinctive phrase in each attack, so a compromise is a definite pass or fail rather than a judgement about whether an answer “looks wrong”. Judging by eye is exactly how this class of fault gets missed.</w:t>
-      </w:r>
-    </w:p>
-    <w:p>
-      <w:r>
-        <w:t>How I implemented it: Retrieved passages are now marked as data with visible boundaries rather than being separated by layout alone, and the boundary marker is removed from the passage text first — otherwise a document containing it could close the region early and have the rest read as instructions. Both sets of operating instructions now state an explicit order of precedence, and a final check catches any disclosure. The suite went from 11 checks passing and 4 failing to 18 passing and none failing.</w:t>
-      </w:r>
-    </w:p>
-    <w:p>
-      <w:r>
+        <w:rPr>
+          <w:b/>
+        </w:rPr>
+        <w:t xml:space="preserve">What I did: </w:t>
+      </w:r>
+      <w:r>
+        <w:rPr/>
+        <w:t>Wrote and ran a deliberate attack suite against the live assistant, covering instructions hidden in document contents, instructions in the question itself, attempts to make it recite its own operating instructions, attempts to reach another person’s files through it, misuse of the file-export feature, and invented sources. It found real faults, which I then fixed.</w:t>
+      </w:r>
+    </w:p>
+    <w:p>
+      <w:r>
+        <w:rPr>
+          <w:b/>
+        </w:rPr>
+        <w:t xml:space="preserve">Decision made: </w:t>
+      </w:r>
+      <w:r>
+        <w:rPr/>
+        <w:t>I made the attack checks mechanical by planting a distinctive phrase in each attack, so a compromise is a definite pass or fail rather than a judgement about whether an answer “looks wrong”. Judging by eye is exactly how this class of fault gets missed.</w:t>
+      </w:r>
+    </w:p>
+    <w:p>
+      <w:r>
+        <w:rPr>
+          <w:b/>
+        </w:rPr>
+        <w:t xml:space="preserve">How I implemented it: </w:t>
+      </w:r>
+      <w:r>
+        <w:rPr/>
+        <w:t>Retrieved passages are now marked as data with visible boundaries rather than being separated by layout alone, and the boundary marker is removed from the passage text first — otherwise a document containing it could close the region early and have the rest read as instructions. Both sets of operating instructions now state an explicit order of precedence, and a final check catches any disclosure. The suite went from 11 checks passing and 4 failing to 18 passing and none failing.</w:t>
+      </w:r>
+    </w:p>
+    <w:p>
+      <w:r>
+        <w:rPr>
+          <w:b/>
+        </w:rPr>
         <w:t>Challenges faced:</w:t>
       </w:r>
     </w:p>

</xml_diff>